<commit_message>
docs(capstone): corregir referencias desactualizadas y aclarar pendientes de revision
</commit_message>
<xml_diff>
--- a/documentacion/capstone/Fase_2/Evidencias_Grupales/2.4_GuiaEstudiante_Fase_2_DesarrolloProyecto_APT_MPAZ_RFID_ANEXOS_VERIFICABLES_REVISION.docx
+++ b/documentacion/capstone/Fase_2/Evidencias_Grupales/2.4_GuiaEstudiante_Fase_2_DesarrolloProyecto_APT_MPAZ_RFID_ANEXOS_VERIFICABLES_REVISION.docx
@@ -2464,7 +2464,7 @@
                 <w:color w:val="222D3B"/>
                 <w:sz w:val="14"/>
               </w:rPr>
-              <w:t>Ficha 04 declara 25 %; sin anexos</w:t>
+              <w:t>Ficha 04 declara 25 %; anexos B1–B3 parciales</w:t>
             </w:r>
           </w:p>
         </w:tc>
@@ -2900,7 +2900,7 @@
                 <w:color w:val="222D3B"/>
                 <w:sz w:val="18"/>
               </w:rPr>
-              <w:t>Facilitadores: disponibilidad de Python, Flask y SQLite, avance incremental y documentación de las iteraciones. Dificultades: coordinación entre software y dispositivo físico, dependencia de red, manejo de eventos repetidos y necesidad de demostrar las pruebas con evidencias. La Ficha 02 señala que la integración física estaba pendiente; la Ficha 04 informa avances posteriores en este componente. Las fichas atribuyen algunas tareas de backend a Lucas, mientras la guía 1.5 distribuye el software principalmente a Samantha. Esta diferencia debe aclararse con ambos integrantes antes de la entrega definitiva.</w:t>
+              <w:t>Facilitadores: disponibilidad de Python, Flask y SQLite, avance incremental y documentación de las iteraciones. Dificultades: coordinación entre software y dispositivo físico, dependencia de red, manejo de eventos repetidos y necesidad de demostrar las pruebas con evidencias. La Ficha 02 señala que la integración física estaba pendiente; la Ficha 04 informa avances posteriores en este componente. Las fichas atribuyen algunas tareas de backend a Lucas, mientras la guía 1.5 distribuye el software principalmente a Samantha. Las guías 1.5 y 2.1 proponen software a Samantha y hardware a Lucas; la autoría efectiva de cada tarea debe confirmarse entre ambos y anotarse, conservando las fichas históricas.</w:t>
             </w:r>
           </w:p>
         </w:tc>
@@ -3056,7 +3056,7 @@
                 <w:color w:val="222D3B"/>
                 <w:sz w:val="18"/>
               </w:rPr>
-              <w:t>Al 06-10-2026, la Ficha 04 identifica la administración de tótems como parcial (50 %) y las pruebas finales/documentación como iniciadas (25 %). El piloto controlado, los anexos de capturas y la validación final se planificaron para el cierre; no hay constancia aquí de su realización. La estrategia propuesta consiste en completar estos incrementos, registrar casos con datos ficticios, reunir las capturas en Fase 2 y solicitar retroalimentación del docente. No se declara ninguna prueba pendiente como aprobada.</w:t>
+              <w:t>Al 06-10-2026, la Ficha 04 identifica la administración de tótems como parcial (50 %) y las pruebas finales/documentación como iniciadas (25 %). El piloto y la validación final siguen pendientes. Los anexos B1–B3 ya documentan tablas y consulta SQLite, comunicación ESP32–API y rechazo de evento repetido; no acreditan el cierre integral. La estrategia propuesta consiste en completar estos incrementos, registrar casos con datos ficticios, reunir las capturas en Fase 2 y solicitar retroalimentación del docente. No se declara ninguna prueba pendiente como aprobada.</w:t>
             </w:r>
           </w:p>
         </w:tc>
@@ -3092,7 +3092,7 @@
           <w:rFonts w:ascii="Calibri" w:hAnsi="Calibri"/>
           <w:sz w:val="16"/>
         </w:rPr>
-        <w:t>Referencias: Fichas de avance 02 (23-09-2026), 03 y 04 (06-10-2026); Guía 1.5 Fase 1. Originales de las figuras: MPAZ_RFID_Diagramas_para_Profesor.pdf (3 láminas) y MPAZ_RFID_Guia_Visual_para_Profesor.pdf (4 láminas), disponibles en documentacion/capstone/Fase_2/Evidencias_Proyecto/Evidencias_Documentacion/ de la rama capstone/organizacion-evidencias. Anexos A1–A3 a continuación. Las capturas de pruebas funcionales siguen pendientes.</w:t>
+        <w:t>Referencias: Fichas de avance 02 (23-09-2026), 03 y 04 (06-10-2026); Guía 1.5 Fase 1. Originales de las figuras: MPAZ_RFID_Diagramas_para_Profesor.pdf (3 láminas) y MPAZ_RFID_Guia_Visual_para_Profesor.pdf (4 láminas), disponibles en documentacion/capstone/Fase_2/Evidencias_Proyecto/Evidencias_Documentacion/ de la rama capstone/organizacion-evidencias. Se incluyen anexos A1–A3 de diseño y B1–B3 de ejecución. Siguen pendientes capturas de interfaz, exportación, nueva asistencia correlacionada y piloto.</w:t>
       </w:r>
     </w:p>
     <w:p>

</xml_diff>